<commit_message>
Minor Code Clean up
</commit_message>
<xml_diff>
--- a/K2234682_Level3_Report.docx
+++ b/K2234682_Level3_Report.docx
@@ -64,21 +64,7 @@
         <w:rPr>
           <w:rFonts w:ascii="Times New Roman" w:hAnsi="Times New Roman" w:cs="Times New Roman"/>
         </w:rPr>
-        <w:t xml:space="preserve"> Cat-Astrophic (</w:t>
-      </w:r>
-      <w:proofErr w:type="spellStart"/>
-      <w:r>
-        <w:rPr>
-          <w:rFonts w:ascii="Times New Roman" w:hAnsi="Times New Roman" w:cs="Times New Roman"/>
-        </w:rPr>
-        <w:t>Shohrukhi</w:t>
-      </w:r>
-      <w:proofErr w:type="spellEnd"/>
-      <w:r>
-        <w:rPr>
-          <w:rFonts w:ascii="Times New Roman" w:hAnsi="Times New Roman" w:cs="Times New Roman"/>
-        </w:rPr>
-        <w:t xml:space="preserve"> et al., 2024), I decided to alter my indoor scene to be a cute house scene where the player is a cat in near first-person view. Wanted it to be bright, colourful and cartoony.</w:t>
+        <w:t xml:space="preserve"> Cat-Astrophic (Shohrukhi et al., 2024), I decided to alter my indoor scene to be a cute house scene where the player is a cat in near first-person view. Wanted it to be bright, colourful and cartoony.</w:t>
       </w:r>
     </w:p>
     <w:p>
@@ -173,6 +159,7 @@
             <w:r>
               <w:rPr>
                 <w:rFonts w:ascii="Times New Roman" w:hAnsi="Times New Roman" w:cs="Times New Roman"/>
+                <w:noProof/>
               </w:rPr>
               <w:drawing>
                 <wp:anchor distT="0" distB="0" distL="114300" distR="114300" simplePos="0" relativeHeight="251659264" behindDoc="0" locked="0" layoutInCell="1" allowOverlap="1" wp14:anchorId="3B89EF05" wp14:editId="2F3BAF9C">
@@ -412,6 +399,7 @@
       <w:r>
         <w:rPr>
           <w:rFonts w:ascii="Times New Roman" w:hAnsi="Times New Roman" w:cs="Times New Roman"/>
+          <w:noProof/>
         </w:rPr>
         <w:drawing>
           <wp:inline distT="0" distB="0" distL="0" distR="0" wp14:anchorId="3A619337" wp14:editId="34770C8D">
@@ -504,6 +492,7 @@
       <w:r>
         <w:rPr>
           <w:rFonts w:ascii="Times New Roman" w:hAnsi="Times New Roman" w:cs="Times New Roman"/>
+          <w:noProof/>
         </w:rPr>
         <w:drawing>
           <wp:inline distT="0" distB="0" distL="0" distR="0" wp14:anchorId="1C6A958F" wp14:editId="5CC6AB12">
@@ -612,6 +601,7 @@
       <w:r>
         <w:rPr>
           <w:rFonts w:ascii="Times New Roman" w:hAnsi="Times New Roman" w:cs="Times New Roman"/>
+          <w:noProof/>
         </w:rPr>
         <w:drawing>
           <wp:inline distT="0" distB="0" distL="0" distR="0" wp14:anchorId="2A7230C7" wp14:editId="6D03D61A">
@@ -827,6 +817,7 @@
             <w:r>
               <w:rPr>
                 <w:rFonts w:ascii="Times New Roman" w:hAnsi="Times New Roman" w:cs="Times New Roman"/>
+                <w:noProof/>
               </w:rPr>
               <w:drawing>
                 <wp:inline distT="0" distB="0" distL="0" distR="0" wp14:anchorId="20BA27ED" wp14:editId="21285330">
@@ -867,6 +858,7 @@
             <w:r>
               <w:rPr>
                 <w:rFonts w:ascii="Times New Roman" w:hAnsi="Times New Roman" w:cs="Times New Roman"/>
+                <w:noProof/>
               </w:rPr>
               <w:drawing>
                 <wp:inline distT="0" distB="0" distL="0" distR="0" wp14:anchorId="74C4ECAA" wp14:editId="73A76AFA">
@@ -1001,7 +993,13 @@
         <w:rPr>
           <w:rFonts w:ascii="Times New Roman" w:hAnsi="Times New Roman" w:cs="Times New Roman"/>
         </w:rPr>
-        <w:t>would have been an excessive amount of work</w:t>
+        <w:t xml:space="preserve">would have been </w:t>
+      </w:r>
+      <w:r>
+        <w:rPr>
+          <w:rFonts w:ascii="Times New Roman" w:hAnsi="Times New Roman" w:cs="Times New Roman"/>
+        </w:rPr>
+        <w:t>inefficient</w:t>
       </w:r>
       <w:r>
         <w:rPr>
@@ -1019,6 +1017,7 @@
       <w:r>
         <w:rPr>
           <w:rFonts w:ascii="Times New Roman" w:hAnsi="Times New Roman" w:cs="Times New Roman"/>
+          <w:noProof/>
         </w:rPr>
         <w:lastRenderedPageBreak/>
         <w:drawing>
@@ -1129,41 +1128,13 @@
               <w:rPr>
                 <w:rFonts w:ascii="Times New Roman" w:hAnsi="Times New Roman" w:cs="Times New Roman"/>
               </w:rPr>
-              <w:t>ied loading .</w:t>
-            </w:r>
-            <w:proofErr w:type="spellStart"/>
-            <w:r>
-              <w:rPr>
-                <w:rFonts w:ascii="Times New Roman" w:hAnsi="Times New Roman" w:cs="Times New Roman"/>
-              </w:rPr>
-              <w:t>mtl</w:t>
-            </w:r>
-            <w:proofErr w:type="spellEnd"/>
-            <w:r>
-              <w:rPr>
-                <w:rFonts w:ascii="Times New Roman" w:hAnsi="Times New Roman" w:cs="Times New Roman"/>
-              </w:rPr>
-              <w:t xml:space="preserve"> materials into the obj. </w:t>
+              <w:t xml:space="preserve">ied loading .mtl materials into the obj. </w:t>
             </w:r>
             <w:r>
               <w:rPr>
                 <w:rFonts w:ascii="Times New Roman" w:hAnsi="Times New Roman" w:cs="Times New Roman"/>
               </w:rPr>
-              <w:t>using .</w:t>
-            </w:r>
-            <w:proofErr w:type="spellStart"/>
-            <w:r>
-              <w:rPr>
-                <w:rFonts w:ascii="Times New Roman" w:hAnsi="Times New Roman" w:cs="Times New Roman"/>
-              </w:rPr>
-              <w:t>loadMaterials</w:t>
-            </w:r>
-            <w:proofErr w:type="spellEnd"/>
-            <w:r>
-              <w:rPr>
-                <w:rFonts w:ascii="Times New Roman" w:hAnsi="Times New Roman" w:cs="Times New Roman"/>
-              </w:rPr>
-              <w:t xml:space="preserve"> – however this gave</w:t>
+              <w:t>using .loadMaterials – however this gave</w:t>
             </w:r>
             <w:r>
               <w:rPr>
@@ -1201,7 +1172,7 @@
                 <w:noProof/>
               </w:rPr>
               <w:drawing>
-                <wp:anchor distT="0" distB="0" distL="114300" distR="114300" simplePos="0" relativeHeight="251660288" behindDoc="0" locked="0" layoutInCell="1" allowOverlap="1" wp14:anchorId="4BE27135" wp14:editId="01C8F7EA">
+                <wp:anchor distT="0" distB="0" distL="114300" distR="114300" simplePos="0" relativeHeight="251660288" behindDoc="0" locked="0" layoutInCell="1" allowOverlap="1" wp14:anchorId="4BE27135" wp14:editId="13293088">
                   <wp:simplePos x="0" y="0"/>
                   <wp:positionH relativeFrom="column">
                     <wp:posOffset>-65405</wp:posOffset>
@@ -1271,6 +1242,7 @@
             <w:r>
               <w:rPr>
                 <w:rFonts w:ascii="Times New Roman" w:hAnsi="Times New Roman" w:cs="Times New Roman"/>
+                <w:noProof/>
               </w:rPr>
               <w:drawing>
                 <wp:anchor distT="0" distB="0" distL="114300" distR="114300" simplePos="0" relativeHeight="251661312" behindDoc="0" locked="0" layoutInCell="1" allowOverlap="1" wp14:anchorId="5EDC46C7" wp14:editId="2E9E1644">
@@ -1436,6 +1408,7 @@
       <w:r>
         <w:rPr>
           <w:rFonts w:ascii="Times New Roman" w:hAnsi="Times New Roman" w:cs="Times New Roman"/>
+          <w:noProof/>
         </w:rPr>
         <w:drawing>
           <wp:inline distT="0" distB="0" distL="0" distR="0" wp14:anchorId="287F7EC5" wp14:editId="3E2F032A">
@@ -1476,6 +1449,7 @@
       <w:r>
         <w:rPr>
           <w:rFonts w:ascii="Times New Roman" w:hAnsi="Times New Roman" w:cs="Times New Roman"/>
+          <w:noProof/>
         </w:rPr>
         <w:drawing>
           <wp:inline distT="0" distB="0" distL="0" distR="0" wp14:anchorId="40590300" wp14:editId="31D4F87C">
@@ -1516,6 +1490,7 @@
       <w:r>
         <w:rPr>
           <w:rFonts w:ascii="Times New Roman" w:hAnsi="Times New Roman" w:cs="Times New Roman"/>
+          <w:noProof/>
         </w:rPr>
         <w:drawing>
           <wp:inline distT="0" distB="0" distL="0" distR="0" wp14:anchorId="5729EF77" wp14:editId="7ED49878">
@@ -1600,6 +1575,7 @@
       <w:r>
         <w:rPr>
           <w:rFonts w:ascii="Times New Roman" w:hAnsi="Times New Roman" w:cs="Times New Roman"/>
+          <w:noProof/>
         </w:rPr>
         <w:drawing>
           <wp:inline distT="0" distB="0" distL="0" distR="0" wp14:anchorId="0A3D802A" wp14:editId="165A764F">
@@ -1648,32 +1624,19 @@
         <w:rPr>
           <w:rFonts w:ascii="Times New Roman" w:hAnsi="Times New Roman" w:cs="Times New Roman"/>
         </w:rPr>
-        <w:t xml:space="preserve">Changed the </w:t>
-      </w:r>
-      <w:proofErr w:type="spellStart"/>
-      <w:r>
-        <w:rPr>
-          <w:rFonts w:ascii="Times New Roman" w:hAnsi="Times New Roman" w:cs="Times New Roman"/>
-        </w:rPr>
-        <w:t>uv</w:t>
-      </w:r>
-      <w:proofErr w:type="spellEnd"/>
-      <w:r>
-        <w:rPr>
-          <w:rFonts w:ascii="Times New Roman" w:hAnsi="Times New Roman" w:cs="Times New Roman"/>
-        </w:rPr>
-        <w:t xml:space="preserve"> mapping to change colours to give more diversity in colours as they were all the same colour before.</w:t>
-      </w:r>
-    </w:p>
-    <w:p>
-      <w:pPr>
-        <w:rPr>
-          <w:rFonts w:ascii="Times New Roman" w:hAnsi="Times New Roman" w:cs="Times New Roman"/>
-        </w:rPr>
-      </w:pPr>
-      <w:r>
-        <w:rPr>
-          <w:rFonts w:ascii="Times New Roman" w:hAnsi="Times New Roman" w:cs="Times New Roman"/>
+        <w:t>Changed the uv mapping to change colours to give more diversity in colours as they were all the same colour before.</w:t>
+      </w:r>
+    </w:p>
+    <w:p>
+      <w:pPr>
+        <w:rPr>
+          <w:rFonts w:ascii="Times New Roman" w:hAnsi="Times New Roman" w:cs="Times New Roman"/>
+        </w:rPr>
+      </w:pPr>
+      <w:r>
+        <w:rPr>
+          <w:rFonts w:ascii="Times New Roman" w:hAnsi="Times New Roman" w:cs="Times New Roman"/>
+          <w:noProof/>
         </w:rPr>
         <w:drawing>
           <wp:inline distT="0" distB="0" distL="0" distR="0" wp14:anchorId="0B98FFEA" wp14:editId="079E7CD8">
@@ -1728,19 +1691,7 @@
         <w:rPr>
           <w:rFonts w:ascii="Times New Roman" w:hAnsi="Times New Roman" w:cs="Times New Roman"/>
         </w:rPr>
-        <w:t xml:space="preserve">, and </w:t>
-      </w:r>
-      <w:r>
-        <w:rPr>
-          <w:rFonts w:ascii="Times New Roman" w:hAnsi="Times New Roman" w:cs="Times New Roman"/>
-        </w:rPr>
-        <w:t>made sure it would only appear at certain distance to avoid seeing extreme amounts of steam from far away.</w:t>
-      </w:r>
-      <w:r>
-        <w:rPr>
-          <w:rFonts w:ascii="Times New Roman" w:hAnsi="Times New Roman" w:cs="Times New Roman"/>
-        </w:rPr>
-        <w:t xml:space="preserve"> </w:t>
+        <w:t xml:space="preserve">, and made sure it would only appear at certain distance to avoid seeing extreme amounts of steam from far away. </w:t>
       </w:r>
     </w:p>
     <w:p>
@@ -1858,25 +1809,7 @@
           <w:i/>
           <w:iCs/>
         </w:rPr>
-        <w:t xml:space="preserve">Cesium1 </w:t>
-      </w:r>
-      <w:proofErr w:type="spellStart"/>
-      <w:r>
-        <w:rPr>
-          <w:rFonts w:ascii="Times New Roman" w:hAnsi="Times New Roman" w:cs="Times New Roman"/>
-          <w:i/>
-          <w:iCs/>
-        </w:rPr>
-        <w:t>Github</w:t>
-      </w:r>
-      <w:proofErr w:type="spellEnd"/>
-      <w:r>
-        <w:rPr>
-          <w:rFonts w:ascii="Times New Roman" w:hAnsi="Times New Roman" w:cs="Times New Roman"/>
-          <w:i/>
-          <w:iCs/>
-        </w:rPr>
-        <w:t xml:space="preserve"> Repo.</w:t>
+        <w:t>Cesium1 Github Repo.</w:t>
       </w:r>
       <w:r>
         <w:rPr>
@@ -1937,21 +1870,59 @@
         <w:rPr>
           <w:rFonts w:ascii="Times New Roman" w:hAnsi="Times New Roman" w:cs="Times New Roman"/>
         </w:rPr>
-        <w:t xml:space="preserve">Cat model: </w:t>
-      </w:r>
-      <w:proofErr w:type="spellStart"/>
-      <w:r>
-        <w:rPr>
-          <w:rFonts w:ascii="Times New Roman" w:hAnsi="Times New Roman" w:cs="Times New Roman"/>
-        </w:rPr>
-        <w:t>Shohrukhi</w:t>
-      </w:r>
-      <w:proofErr w:type="spellEnd"/>
-      <w:r>
-        <w:rPr>
-          <w:rFonts w:ascii="Times New Roman" w:hAnsi="Times New Roman" w:cs="Times New Roman"/>
-        </w:rPr>
-        <w:t xml:space="preserve"> et el. (2024) </w:t>
+        <w:t xml:space="preserve">Cat model + walking animation: Omabuarts Studio (2016) Toon Cat FREE. Available at: </w:t>
+      </w:r>
+      <w:hyperlink r:id="rId23" w:history="1">
+        <w:r>
+          <w:rPr>
+            <w:rStyle w:val="Hyperlink"/>
+            <w:rFonts w:ascii="Times New Roman" w:hAnsi="Times New Roman" w:cs="Times New Roman"/>
+          </w:rPr>
+          <w:t>https://sketchfab.com/3d-models/toon-cat-free-b2bd1ee7858444bda366110a2d960386</w:t>
+        </w:r>
+      </w:hyperlink>
+      <w:r>
+        <w:rPr>
+          <w:rFonts w:ascii="Times New Roman" w:hAnsi="Times New Roman" w:cs="Times New Roman"/>
+        </w:rPr>
+        <w:t xml:space="preserve"> Last accessed: 29 April 2025.</w:t>
+      </w:r>
+    </w:p>
+    <w:p>
+      <w:pPr>
+        <w:rPr>
+          <w:rFonts w:ascii="Times New Roman" w:hAnsi="Times New Roman" w:cs="Times New Roman"/>
+        </w:rPr>
+      </w:pPr>
+      <w:r>
+        <w:rPr>
+          <w:rFonts w:ascii="Times New Roman" w:hAnsi="Times New Roman" w:cs="Times New Roman"/>
+        </w:rPr>
+        <w:t xml:space="preserve">Cat </w:t>
+      </w:r>
+      <w:r>
+        <w:rPr>
+          <w:rFonts w:ascii="Times New Roman" w:hAnsi="Times New Roman" w:cs="Times New Roman"/>
+        </w:rPr>
+        <w:t>animations</w:t>
+      </w:r>
+      <w:r>
+        <w:rPr>
+          <w:rFonts w:ascii="Times New Roman" w:hAnsi="Times New Roman" w:cs="Times New Roman"/>
+        </w:rPr>
+        <w:t xml:space="preserve">: </w:t>
+      </w:r>
+      <w:r>
+        <w:rPr>
+          <w:rFonts w:ascii="Times New Roman" w:hAnsi="Times New Roman" w:cs="Times New Roman"/>
+        </w:rPr>
+        <w:t>Christel Thoen</w:t>
+      </w:r>
+      <w:r>
+        <w:rPr>
+          <w:rFonts w:ascii="Times New Roman" w:hAnsi="Times New Roman" w:cs="Times New Roman"/>
+        </w:rPr>
+        <w:t xml:space="preserve"> (2024) </w:t>
       </w:r>
       <w:r>
         <w:rPr>
@@ -1967,7 +1938,7 @@
         </w:rPr>
         <w:t xml:space="preserve">. Available at: </w:t>
       </w:r>
-      <w:hyperlink r:id="rId23" w:history="1">
+      <w:hyperlink r:id="rId24" w:history="1">
         <w:r>
           <w:rPr>
             <w:rStyle w:val="Hyperlink"/>
@@ -2051,7 +2022,7 @@
         </w:rPr>
         <w:t xml:space="preserve">. Available at: </w:t>
       </w:r>
-      <w:hyperlink r:id="rId24" w:history="1">
+      <w:hyperlink r:id="rId25" w:history="1">
         <w:r>
           <w:rPr>
             <w:rStyle w:val="Hyperlink"/>
@@ -2064,13 +2035,7 @@
         <w:rPr>
           <w:rFonts w:ascii="Times New Roman" w:hAnsi="Times New Roman" w:cs="Times New Roman"/>
         </w:rPr>
-        <w:t xml:space="preserve"> </w:t>
-      </w:r>
-      <w:r>
-        <w:rPr>
-          <w:rFonts w:ascii="Times New Roman" w:hAnsi="Times New Roman" w:cs="Times New Roman"/>
-        </w:rPr>
-        <w:t>Last accessed: 29 April 2025.</w:t>
+        <w:t xml:space="preserve"> Last accessed: 29 April 2025.</w:t>
       </w:r>
     </w:p>
     <w:p>
@@ -2085,23 +2050,13 @@
         </w:rPr>
         <w:t xml:space="preserve">Living room and misc.: Lousberg K. (2023) </w:t>
       </w:r>
-      <w:proofErr w:type="spellStart"/>
       <w:r>
         <w:rPr>
           <w:rFonts w:ascii="Times New Roman" w:hAnsi="Times New Roman" w:cs="Times New Roman"/>
           <w:i/>
           <w:iCs/>
         </w:rPr>
-        <w:t>KayKit</w:t>
-      </w:r>
-      <w:proofErr w:type="spellEnd"/>
-      <w:r>
-        <w:rPr>
-          <w:rFonts w:ascii="Times New Roman" w:hAnsi="Times New Roman" w:cs="Times New Roman"/>
-          <w:i/>
-          <w:iCs/>
-        </w:rPr>
-        <w:t xml:space="preserve"> Furniture Bits</w:t>
+        <w:t>KayKit Furniture Bits</w:t>
       </w:r>
       <w:r>
         <w:rPr>
@@ -2109,7 +2064,7 @@
         </w:rPr>
         <w:t xml:space="preserve">. Available at: </w:t>
       </w:r>
-      <w:hyperlink r:id="rId25" w:history="1">
+      <w:hyperlink r:id="rId26" w:history="1">
         <w:r>
           <w:rPr>
             <w:rStyle w:val="Hyperlink"/>
@@ -2122,13 +2077,7 @@
         <w:rPr>
           <w:rFonts w:ascii="Times New Roman" w:hAnsi="Times New Roman" w:cs="Times New Roman"/>
         </w:rPr>
-        <w:t xml:space="preserve"> </w:t>
-      </w:r>
-      <w:r>
-        <w:rPr>
-          <w:rFonts w:ascii="Times New Roman" w:hAnsi="Times New Roman" w:cs="Times New Roman"/>
-        </w:rPr>
-        <w:t>Last accessed: 29 April 2025.</w:t>
+        <w:t xml:space="preserve"> Last accessed: 29 April 2025.</w:t>
       </w:r>
     </w:p>
     <w:p>

</xml_diff>